<commit_message>
Fix cv-parser review findings: DOCX moves, symbols, nested boxes
- Keep text in DOCX tracked moves (w:moveTo) and symbol characters (w:sym);
  read a text box nested in another box once, not twice.
- Enforce PARSER_VERSION: expected outputs carry a manifest pinned to the
  version, and update_expected.py refuses to change one without a raise.
- Add character-order checks for every DOCX fixture and for TeX.
- Record that Markdown Source CVs must be UTF-8 and not empty.
- Use the glossary's "Source CV" in test names and agent docs.
- PARSER_VERSION 2.

Co-Authored-By: Claude Opus 5.5 <noreply@anthropic.com>
</commit_message>
<xml_diff>
--- a/tests/fixtures/generated/cv.docx
+++ b/tests/fixtures/generated/cv.docx
@@ -271,6 +271,160 @@
                     <w:p>
                       <w:r>
                         <w:t>Contact: jordan@example.com</w:t>
+                      </w:r>
+                    </w:p>
+                  </w:txbxContent>
+                </v:textbox>
+              </v:shape>
+            </w:pict>
+          </mc:Fallback>
+        </mc:AlternateContent>
+      </w:r>
+    </w:p>
+    <w:p>
+      <w:r>
+        <w:t xml:space="preserve">Moved: </w:t>
+      </w:r>
+      <w:moveFrom xmlns:a="http://schemas.openxmlformats.org/drawingml/2006/main" w:id="92" w:author="x" w:date="2026-01-01T00:00:00Z">
+        <w:r>
+          <w:t xml:space="preserve">OldPlace </w:t>
+        </w:r>
+      </w:moveFrom>
+      <w:moveTo xmlns:a="http://schemas.openxmlformats.org/drawingml/2006/main" w:id="93" w:author="x" w:date="2026-01-01T00:00:00Z">
+        <w:r>
+          <w:t>MovedWord</w:t>
+        </w:r>
+      </w:moveTo>
+      <w:r>
+        <w:t xml:space="preserve"> end.</w:t>
+      </w:r>
+    </w:p>
+    <w:p>
+      <w:r>
+        <w:t xml:space="preserve">Rating: </w:t>
+      </w:r>
+      <w:r xmlns:a="http://schemas.openxmlformats.org/drawingml/2006/main">
+        <w:sym w:font="Wingdings" w:char="F0B7"/>
+      </w:r>
+      <w:r>
+        <w:t xml:space="preserve"> 5</w:t>
+      </w:r>
+    </w:p>
+    <w:p>
+      <w:r>
+        <w:t>Nested boxes</w:t>
+      </w:r>
+      <w:r xmlns:a="http://schemas.openxmlformats.org/drawingml/2006/main">
+        <mc:AlternateContent>
+          <mc:Choice Requires="wps">
+            <w:drawing>
+              <wp:anchor>
+                <a:graphic>
+                  <a:graphicData>
+                    <wps:wsp>
+                      <wps:txbx>
+                        <w:txbxContent>
+                          <w:p>
+                            <w:r>
+                              <w:t>Outer box</w:t>
+                            </w:r>
+                            <w:r>
+                              <mc:AlternateContent>
+                                <mc:Choice Requires="wps">
+                                  <w:drawing>
+                                    <wp:anchor>
+                                      <a:graphic>
+                                        <a:graphicData>
+                                          <wps:wsp>
+                                            <wps:txbx>
+                                              <w:txbxContent>
+                                                <w:p>
+                                                  <w:r>
+                                                    <w:t>Inner box</w:t>
+                                                  </w:r>
+                                                </w:p>
+                                              </w:txbxContent>
+                                            </wps:txbx>
+                                          </wps:wsp>
+                                        </a:graphicData>
+                                      </a:graphic>
+                                    </wp:anchor>
+                                  </w:drawing>
+                                </mc:Choice>
+                                <mc:Fallback>
+                                  <w:pict>
+                                    <v:shape>
+                                      <v:textbox>
+                                        <w:txbxContent>
+                                          <w:p>
+                                            <w:r>
+                                              <w:t>Inner box</w:t>
+                                            </w:r>
+                                          </w:p>
+                                        </w:txbxContent>
+                                      </v:textbox>
+                                    </v:shape>
+                                  </w:pict>
+                                </mc:Fallback>
+                              </mc:AlternateContent>
+                            </w:r>
+                          </w:p>
+                        </w:txbxContent>
+                      </wps:txbx>
+                    </wps:wsp>
+                  </a:graphicData>
+                </a:graphic>
+              </wp:anchor>
+            </w:drawing>
+          </mc:Choice>
+          <mc:Fallback>
+            <w:pict>
+              <v:shape>
+                <v:textbox>
+                  <w:txbxContent>
+                    <w:p>
+                      <w:r>
+                        <w:t>Outer box</w:t>
+                      </w:r>
+                      <w:r>
+                        <mc:AlternateContent>
+                          <mc:Choice Requires="wps">
+                            <w:drawing>
+                              <wp:anchor>
+                                <a:graphic>
+                                  <a:graphicData>
+                                    <wps:wsp>
+                                      <wps:txbx>
+                                        <w:txbxContent>
+                                          <w:p>
+                                            <w:r>
+                                              <w:t>Inner box</w:t>
+                                            </w:r>
+                                          </w:p>
+                                        </w:txbxContent>
+                                      </wps:txbx>
+                                    </wps:wsp>
+                                  </a:graphicData>
+                                </a:graphic>
+                              </wp:anchor>
+                            </w:drawing>
+                          </mc:Choice>
+                          <mc:Fallback>
+                            <w:pict>
+                              <v:shape>
+                                <v:textbox>
+                                  <w:txbxContent>
+                                    <w:p>
+                                      <w:r>
+                                        <w:t>Inner box</w:t>
+                                      </w:r>
+                                    </w:p>
+                                  </w:txbxContent>
+                                </v:textbox>
+                              </v:shape>
+                            </w:pict>
+                          </mc:Fallback>
+                        </mc:AlternateContent>
                       </w:r>
                     </w:p>
                   </w:txbxContent>

</xml_diff>

<commit_message>
Place footnote text after the block that references it
Footnotes from DOCX and TeX now follow the paragraph or table that
references them, or the whole list, instead of collecting at the end, so
a reader meets each claim's qualifier right after the claim.
update_expected.py now compares against the manifest, so hand-edited
expected outputs also require a PARSER_VERSION raise. PARSER_VERSION 3.

Co-Authored-By: Claude Opus 5.5 <noreply@anthropic.com>
</commit_message>
<xml_diff>
--- a/tests/fixtures/generated/cv.docx
+++ b/tests/fixtures/generated/cv.docx
@@ -208,6 +208,12 @@
           <w:p>
             <w:r>
               <w:t>8</w:t>
+            </w:r>
+            <w:r xmlns:a="http://schemas.openxmlformats.org/drawingml/2006/main">
+              <w:rPr>
+                <w:rStyle w:val="FootnoteReference"/>
+              </w:rPr>
+              <w:footnoteReference w:id="3"/>
             </w:r>
           </w:p>
         </w:tc>
@@ -447,6 +453,12 @@
       <w:r>
         <w:t>English (native), German (C1)</w:t>
       </w:r>
+      <w:r xmlns:a="http://schemas.openxmlformats.org/drawingml/2006/main">
+        <w:rPr>
+          <w:rStyle w:val="FootnoteReference"/>
+        </w:rPr>
+        <w:footnoteReference w:id="2"/>
+      </w:r>
     </w:p>
     <w:sectPr>
       <w:headerReference w:type="default" r:id="rId9"/>
@@ -496,6 +508,26 @@
       </w:r>
       <w:r>
         <w:t xml:space="preserve"> Measured over 2023.</w:t>
+      </w:r>
+    </w:p>
+  </w:footnote>
+  <w:footnote w:id="2">
+    <w:p>
+      <w:r>
+        <w:footnoteRef/>
+      </w:r>
+      <w:r>
+        <w:t xml:space="preserve"> Certified in 2024.</w:t>
+      </w:r>
+    </w:p>
+  </w:footnote>
+  <w:footnote w:id="3">
+    <w:p>
+      <w:r>
+        <w:footnoteRef/>
+      </w:r>
+      <w:r>
+        <w:t xml:space="preserve"> Since 2016.</w:t>
       </w:r>
     </w:p>
   </w:footnote>

</xml_diff>